<commit_message>
feat: added polished style
</commit_message>
<xml_diff>
--- a/backend/word/ZABIEG PQAge.docx
+++ b/backend/word/ZABIEG PQAge.docx
@@ -12,57 +12,51 @@
         <w:rPr>
           <w:rFonts w:ascii="Times New Roman" w:hAnsi="Times New Roman"/>
         </w:rPr>
-        <w:t xml:space="preserve">ZABIEG </w:t>
-      </w:r>
-      <w:proofErr w:type="spellStart"/>
-      <w:r>
-        <w:rPr>
-          <w:rFonts w:ascii="Times New Roman" w:hAnsi="Times New Roman"/>
-        </w:rPr>
-        <w:t>PQAge</w:t>
-      </w:r>
-      <w:proofErr w:type="spellEnd"/>
-    </w:p>
-    <w:p>
-      <w:pPr>
-        <w:rPr>
-          <w:rFonts w:ascii="Times New Roman" w:hAnsi="Times New Roman"/>
-        </w:rPr>
-      </w:pPr>
-    </w:p>
-    <w:p>
-      <w:pPr>
-        <w:rPr>
-          <w:rFonts w:ascii="Times New Roman" w:hAnsi="Times New Roman"/>
-        </w:rPr>
-      </w:pPr>
-      <w:proofErr w:type="spellStart"/>
-      <w:r>
-        <w:rPr>
-          <w:rFonts w:ascii="Times New Roman" w:hAnsi="Times New Roman"/>
-        </w:rPr>
-        <w:t>PQAge</w:t>
-      </w:r>
-      <w:proofErr w:type="spellEnd"/>
-      <w:r>
-        <w:rPr>
-          <w:rFonts w:ascii="Times New Roman" w:hAnsi="Times New Roman"/>
-        </w:rPr>
-        <w:t xml:space="preserve"> jest peelingiem chemicznym opartym głównie na kwasie </w:t>
-      </w:r>
-      <w:proofErr w:type="spellStart"/>
-      <w:r>
-        <w:rPr>
-          <w:rFonts w:ascii="Times New Roman" w:hAnsi="Times New Roman"/>
-        </w:rPr>
-        <w:t>trójchlorooctowym</w:t>
-      </w:r>
-      <w:proofErr w:type="spellEnd"/>
-      <w:r>
-        <w:rPr>
-          <w:rFonts w:ascii="Times New Roman" w:hAnsi="Times New Roman"/>
-        </w:rPr>
-        <w:t xml:space="preserve"> (TCA) stabilizowanym dodatkowymi składnikami aktywnymi. Preparat przenika w głąb skóry, stymulując jej odnowę i poprawiając napięcie, ale jednocześnie działa łagodniej niż klasyczne peelingi TCA.</w:t>
+        <w:t>Z</w:t>
+      </w:r>
+      <w:r>
+        <w:rPr>
+          <w:rFonts w:ascii="Times New Roman" w:hAnsi="Times New Roman"/>
+        </w:rPr>
+        <w:t>abieg</w:t>
+      </w:r>
+      <w:r>
+        <w:rPr>
+          <w:rFonts w:ascii="Times New Roman" w:hAnsi="Times New Roman"/>
+        </w:rPr>
+        <w:t xml:space="preserve"> P</w:t>
+      </w:r>
+      <w:r>
+        <w:rPr>
+          <w:rFonts w:ascii="Times New Roman" w:hAnsi="Times New Roman"/>
+        </w:rPr>
+        <w:t>q</w:t>
+      </w:r>
+      <w:r>
+        <w:rPr>
+          <w:rFonts w:ascii="Times New Roman" w:hAnsi="Times New Roman"/>
+        </w:rPr>
+        <w:t>Age</w:t>
+      </w:r>
+    </w:p>
+    <w:p>
+      <w:pPr>
+        <w:rPr>
+          <w:rFonts w:ascii="Times New Roman" w:hAnsi="Times New Roman"/>
+        </w:rPr>
+      </w:pPr>
+    </w:p>
+    <w:p>
+      <w:pPr>
+        <w:rPr>
+          <w:rFonts w:ascii="Times New Roman" w:hAnsi="Times New Roman"/>
+        </w:rPr>
+      </w:pPr>
+      <w:r>
+        <w:rPr>
+          <w:rFonts w:ascii="Times New Roman" w:hAnsi="Times New Roman"/>
+        </w:rPr>
+        <w:t>PQAge jest peelingiem chemicznym opartym głównie na kwasie trójchlorooctowym (TCA) stabilizowanym dodatkowymi składnikami aktywnymi. Preparat przenika w głąb skóry, stymulując jej odnowę i poprawiając napięcie, ale jednocześnie działa łagodniej niż klasyczne peelingi TCA.</w:t>
       </w:r>
     </w:p>
     <w:p>
@@ -108,21 +102,7 @@
         <w:rPr>
           <w:rFonts w:ascii="Times New Roman" w:hAnsi="Times New Roman"/>
         </w:rPr>
-        <w:t xml:space="preserve">*34% kwas </w:t>
-      </w:r>
-      <w:proofErr w:type="spellStart"/>
-      <w:r>
-        <w:rPr>
-          <w:rFonts w:ascii="Times New Roman" w:hAnsi="Times New Roman"/>
-        </w:rPr>
-        <w:t>trójchlorooctowY</w:t>
-      </w:r>
-      <w:proofErr w:type="spellEnd"/>
-      <w:r>
-        <w:rPr>
-          <w:rFonts w:ascii="Times New Roman" w:hAnsi="Times New Roman"/>
-        </w:rPr>
-        <w:t xml:space="preserve"> (TCA)** – pobudza odnowę skóry i syntezę kolagenu, wygładza zmarszczki i blizny</w:t>
+        <w:t>*34% kwas trójchlorooctowY (TCA)** – pobudza odnowę skóry i syntezę kolagenu, wygładza zmarszczki i blizny</w:t>
       </w:r>
     </w:p>
     <w:p>
@@ -391,16 +371,8 @@
         <w:rPr>
           <w:rFonts w:ascii="Times New Roman" w:hAnsi="Times New Roman"/>
         </w:rPr>
-        <w:t xml:space="preserve">3. Aplikacja preparatu </w:t>
-      </w:r>
-      <w:proofErr w:type="spellStart"/>
-      <w:r>
-        <w:rPr>
-          <w:rFonts w:ascii="Times New Roman" w:hAnsi="Times New Roman"/>
-        </w:rPr>
-        <w:t>PQAge</w:t>
-      </w:r>
-      <w:proofErr w:type="spellEnd"/>
+        <w:t>3. Aplikacja preparatu PQAge</w:t>
+      </w:r>
     </w:p>
     <w:p>
       <w:pPr>
@@ -733,35 +705,7 @@
         <w:rPr>
           <w:rFonts w:ascii="Times New Roman" w:hAnsi="Times New Roman"/>
         </w:rPr>
-        <w:t xml:space="preserve">* stosowanie </w:t>
-      </w:r>
-      <w:proofErr w:type="spellStart"/>
-      <w:r>
-        <w:rPr>
-          <w:rFonts w:ascii="Times New Roman" w:hAnsi="Times New Roman"/>
-        </w:rPr>
-        <w:t>retinoidów</w:t>
-      </w:r>
-      <w:proofErr w:type="spellEnd"/>
-      <w:r>
-        <w:rPr>
-          <w:rFonts w:ascii="Times New Roman" w:hAnsi="Times New Roman"/>
-        </w:rPr>
-        <w:t xml:space="preserve"> doustnych, np. </w:t>
-      </w:r>
-      <w:proofErr w:type="spellStart"/>
-      <w:r>
-        <w:rPr>
-          <w:rFonts w:ascii="Times New Roman" w:hAnsi="Times New Roman"/>
-        </w:rPr>
-        <w:t>Isotretinoin</w:t>
-      </w:r>
-      <w:proofErr w:type="spellEnd"/>
-      <w:r>
-        <w:rPr>
-          <w:rFonts w:ascii="Times New Roman" w:hAnsi="Times New Roman"/>
-        </w:rPr>
-        <w:t xml:space="preserve"> (zwykle do 6 miesięcy po zakończeniu terapii)</w:t>
+        <w:t>* stosowanie retinoidów doustnych, np. Isotretinoin (zwykle do 6 miesięcy po zakończeniu terapii)</w:t>
       </w:r>
     </w:p>
     <w:p>
@@ -840,13 +784,7 @@
         <w:rPr>
           <w:rFonts w:ascii="Times New Roman" w:hAnsi="Times New Roman"/>
         </w:rPr>
-        <w:t xml:space="preserve">Wskazówki </w:t>
-      </w:r>
-      <w:r>
-        <w:rPr>
-          <w:rFonts w:ascii="Times New Roman" w:hAnsi="Times New Roman"/>
-        </w:rPr>
-        <w:t>po zabiegu :</w:t>
+        <w:t>Wskazówki po zabiegu :</w:t>
       </w:r>
     </w:p>
     <w:p>

</xml_diff>